<commit_message>
Wire live Vercel URLs into landing + D2.2
</commit_message>
<xml_diff>
--- a/ARISE_D2.2_UI_UX_Specifications.docx
+++ b/ARISE_D2.2_UI_UX_Specifications.docx
@@ -4375,7 +4375,207 @@
     </w:p>
     <w:p>
       <w:r>
-        <w:t>The executable mockups are at:</w:t>
+        <w:t>The prototype is deployed live on Vercel and reviewable directly from a browser without any local setup.</w:t>
+      </w:r>
+    </w:p>
+    <w:tbl>
+      <w:tblPr>
+        <w:tblStyle w:val="TableGrid"/>
+        <w:tblW w:type="auto" w:w="0"/>
+        <w:tblLook w:firstColumn="1" w:firstRow="1" w:lastColumn="0" w:lastRow="0" w:noHBand="0" w:noVBand="1" w:val="04A0"/>
+      </w:tblPr>
+      <w:tblGrid>
+        <w:gridCol w:w="3137"/>
+        <w:gridCol w:w="3137"/>
+        <w:gridCol w:w="3137"/>
+      </w:tblGrid>
+      <w:tr>
+        <w:tc>
+          <w:tcPr>
+            <w:tcW w:type="dxa" w:w="3137"/>
+            <w:shd w:fill="1A335C"/>
+            <w:vAlign w:val="center"/>
+          </w:tcPr>
+          <w:p>
+            <w:r>
+              <w:rPr>
+                <w:b/>
+                <w:color w:val="FFFFFF"/>
+              </w:rPr>
+            </w:r>
+            <w:r>
+              <w:rPr>
+                <w:b/>
+                <w:color w:val="FFFFFF"/>
+              </w:rPr>
+              <w:t>Application</w:t>
+            </w:r>
+          </w:p>
+        </w:tc>
+        <w:tc>
+          <w:tcPr>
+            <w:tcW w:type="dxa" w:w="3137"/>
+            <w:shd w:fill="1A335C"/>
+            <w:vAlign w:val="center"/>
+          </w:tcPr>
+          <w:p>
+            <w:r>
+              <w:rPr>
+                <w:b/>
+                <w:color w:val="FFFFFF"/>
+              </w:rPr>
+            </w:r>
+            <w:r>
+              <w:rPr>
+                <w:b/>
+                <w:color w:val="FFFFFF"/>
+              </w:rPr>
+              <w:t>Live URL</w:t>
+            </w:r>
+          </w:p>
+        </w:tc>
+        <w:tc>
+          <w:tcPr>
+            <w:tcW w:type="dxa" w:w="3137"/>
+            <w:shd w:fill="1A335C"/>
+            <w:vAlign w:val="center"/>
+          </w:tcPr>
+          <w:p>
+            <w:r>
+              <w:rPr>
+                <w:b/>
+                <w:color w:val="FFFFFF"/>
+              </w:rPr>
+            </w:r>
+            <w:r>
+              <w:rPr>
+                <w:b/>
+                <w:color w:val="FFFFFF"/>
+              </w:rPr>
+              <w:t>Demo credentials</w:t>
+            </w:r>
+          </w:p>
+        </w:tc>
+      </w:tr>
+      <w:tr>
+        <w:tc>
+          <w:tcPr>
+            <w:tcW w:type="dxa" w:w="3137"/>
+            <w:vAlign w:val="center"/>
+          </w:tcPr>
+          <w:p>
+            <w:r/>
+            <w:r>
+              <w:t>Landing page</w:t>
+            </w:r>
+          </w:p>
+        </w:tc>
+        <w:tc>
+          <w:tcPr>
+            <w:tcW w:type="dxa" w:w="3137"/>
+            <w:vAlign w:val="center"/>
+          </w:tcPr>
+          <w:p>
+            <w:r/>
+            <w:r>
+              <w:t>https://arise-prototype-kjt9.vercel.app</w:t>
+            </w:r>
+          </w:p>
+        </w:tc>
+        <w:tc>
+          <w:tcPr>
+            <w:tcW w:type="dxa" w:w="3137"/>
+            <w:vAlign w:val="center"/>
+          </w:tcPr>
+          <w:p>
+            <w:r/>
+            <w:r>
+              <w:t>not required</w:t>
+            </w:r>
+          </w:p>
+        </w:tc>
+      </w:tr>
+      <w:tr>
+        <w:tc>
+          <w:tcPr>
+            <w:tcW w:type="dxa" w:w="3137"/>
+            <w:vAlign w:val="center"/>
+          </w:tcPr>
+          <w:p>
+            <w:r/>
+            <w:r>
+              <w:t>Coach app</w:t>
+            </w:r>
+          </w:p>
+        </w:tc>
+        <w:tc>
+          <w:tcPr>
+            <w:tcW w:type="dxa" w:w="3137"/>
+            <w:vAlign w:val="center"/>
+          </w:tcPr>
+          <w:p>
+            <w:r/>
+            <w:r>
+              <w:t>https://arise-prototype.vercel.app</w:t>
+            </w:r>
+          </w:p>
+        </w:tc>
+        <w:tc>
+          <w:tcPr>
+            <w:tcW w:type="dxa" w:w="3137"/>
+            <w:vAlign w:val="center"/>
+          </w:tcPr>
+          <w:p>
+            <w:r/>
+            <w:r>
+              <w:t>any Patient ID, any password</w:t>
+            </w:r>
+          </w:p>
+        </w:tc>
+      </w:tr>
+      <w:tr>
+        <w:tc>
+          <w:tcPr>
+            <w:tcW w:type="dxa" w:w="3137"/>
+            <w:vAlign w:val="center"/>
+          </w:tcPr>
+          <w:p>
+            <w:r/>
+            <w:r>
+              <w:t>Therapist app</w:t>
+            </w:r>
+          </w:p>
+        </w:tc>
+        <w:tc>
+          <w:tcPr>
+            <w:tcW w:type="dxa" w:w="3137"/>
+            <w:vAlign w:val="center"/>
+          </w:tcPr>
+          <w:p>
+            <w:r/>
+            <w:r>
+              <w:t>https://arise-prototype-622c.vercel.app</w:t>
+            </w:r>
+          </w:p>
+        </w:tc>
+        <w:tc>
+          <w:tcPr>
+            <w:tcW w:type="dxa" w:w="3137"/>
+            <w:vAlign w:val="center"/>
+          </w:tcPr>
+          <w:p>
+            <w:r/>
+            <w:r>
+              <w:t>any Clinician ID, any password</w:t>
+            </w:r>
+          </w:p>
+        </w:tc>
+      </w:tr>
+    </w:tbl>
+    <w:p/>
+    <w:p>
+      <w:r>
+        <w:t>The source code lives in a public GitHub repository at https://github.com/Hadilmeaw/arise-prototype. Relevant paths inside the repository:</w:t>
       </w:r>
     </w:p>
     <w:p>
@@ -4439,8 +4639,23 @@
       </w:r>
     </w:p>
     <w:p>
+      <w:pPr>
+        <w:pStyle w:val="ListBullet"/>
+      </w:pPr>
       <w:r>
-        <w:t xml:space="preserve">To run either app: </w:t>
+        <w:rPr>
+          <w:rFonts w:ascii="Consolas" w:hAnsi="Consolas"/>
+          <w:sz w:val="20"/>
+        </w:rPr>
+        <w:t>apps/landing/index.html</w:t>
+      </w:r>
+      <w:r>
+        <w:t xml:space="preserve"> — Landing page.</w:t>
+      </w:r>
+    </w:p>
+    <w:p>
+      <w:r>
+        <w:t xml:space="preserve">To run either React app locally: </w:t>
       </w:r>
       <w:r>
         <w:rPr>
@@ -4450,22 +4665,22 @@
         <w:t>cd apps/&lt;app&gt; &amp;&amp; npm install &amp;&amp; npm run dev</w:t>
       </w:r>
       <w:r>
-        <w:t>. Both apps are fully interactive in the browser without a back-end.</w:t>
+        <w:t>. Both apps are fully interactive in the browser without a back-end. The landing page is a single static HTML file and requires no build step.</w:t>
       </w:r>
     </w:p>
     <w:p>
       <w:r>
-        <w:t xml:space="preserve">Screenshots of each screen referenced in Sections 5 and 6 are stored in </w:t>
+        <w:t xml:space="preserve">Screenshots of each screen referenced in Sections 5 and 6 are embedded above and stored under </w:t>
       </w:r>
       <w:r>
         <w:rPr>
           <w:rFonts w:ascii="Consolas" w:hAnsi="Consolas"/>
           <w:sz w:val="20"/>
         </w:rPr>
-        <w:t>docs/d2.2_mockups/</w:t>
+        <w:t>docs/d22_figures/</w:t>
       </w:r>
       <w:r>
-        <w:t xml:space="preserve"> and are to be embedded in the docx companion to this document.</w:t>
+        <w:t>.</w:t>
       </w:r>
     </w:p>
     <w:p>

</xml_diff>

<commit_message>
D2.2: rely on live URLs, drop still screenshots
</commit_message>
<xml_diff>
--- a/ARISE_D2.2_UI_UX_Specifications.docx
+++ b/ARISE_D2.2_UI_UX_Specifications.docx
@@ -1380,34 +1380,6 @@
     </w:p>
     <w:p>
       <w:pPr>
-        <w:jc w:val="center"/>
-      </w:pPr>
-      <w:r/>
-      <w:r>
-        <w:rPr>
-          <w:i/>
-          <w:color w:val="C02A2A"/>
-        </w:rPr>
-        <w:t>[Image not found: docs/d22_figures/coach_login.png]</w:t>
-      </w:r>
-    </w:p>
-    <w:p>
-      <w:pPr>
-        <w:spacing w:after="200"/>
-        <w:jc w:val="center"/>
-      </w:pPr>
-      <w:r>
-        <w:rPr>
-          <w:rFonts w:ascii="Calibri" w:hAnsi="Calibri"/>
-          <w:i/>
-          <w:color w:val="6B6B6B"/>
-          <w:sz w:val="18"/>
-        </w:rPr>
-        <w:t>Coach login screen.</w:t>
-      </w:r>
-    </w:p>
-    <w:p>
-      <w:pPr>
         <w:pStyle w:val="Heading3"/>
       </w:pPr>
       <w:r>
@@ -1417,34 +1389,6 @@
     <w:p>
       <w:r>
         <w:t>Soft greeting ("Hello.") with a one-paragraph lede, a single primary call to action ("I'm ready"), and a small instructional tip below. The breathing background ring provides a focal point and signals the device is alive without demanding attention. The header carries a discrete navigation pill (Today, History, Settings) and the patient identifier. This pill disappears during Calibration and Active to keep the body of the participant the only thing on screen.</w:t>
-      </w:r>
-    </w:p>
-    <w:p>
-      <w:pPr>
-        <w:jc w:val="center"/>
-      </w:pPr>
-      <w:r/>
-      <w:r>
-        <w:rPr>
-          <w:i/>
-          <w:color w:val="C02A2A"/>
-        </w:rPr>
-        <w:t>[Image not found: docs/d22_figures/coach_idle.png]</w:t>
-      </w:r>
-    </w:p>
-    <w:p>
-      <w:pPr>
-        <w:spacing w:after="200"/>
-        <w:jc w:val="center"/>
-      </w:pPr>
-      <w:r>
-        <w:rPr>
-          <w:rFonts w:ascii="Calibri" w:hAnsi="Calibri"/>
-          <w:i/>
-          <w:color w:val="6B6B6B"/>
-          <w:sz w:val="18"/>
-        </w:rPr>
-        <w:t>Coach idle screen.</w:t>
       </w:r>
     </w:p>
     <w:p>
@@ -1500,62 +1444,6 @@
     </w:p>
     <w:p>
       <w:pPr>
-        <w:jc w:val="center"/>
-      </w:pPr>
-      <w:r/>
-      <w:r>
-        <w:rPr>
-          <w:i/>
-          <w:color w:val="C02A2A"/>
-        </w:rPr>
-        <w:t>[Image not found: docs/d22_figures/coach_calibrate_pose.png]</w:t>
-      </w:r>
-    </w:p>
-    <w:p>
-      <w:pPr>
-        <w:spacing w:after="200"/>
-        <w:jc w:val="center"/>
-      </w:pPr>
-      <w:r>
-        <w:rPr>
-          <w:rFonts w:ascii="Calibri" w:hAnsi="Calibri"/>
-          <w:i/>
-          <w:color w:val="6B6B6B"/>
-          <w:sz w:val="18"/>
-        </w:rPr>
-        <w:t>Coach calibration, positioning step (auto-detection of frame and pose).</w:t>
-      </w:r>
-    </w:p>
-    <w:p>
-      <w:pPr>
-        <w:jc w:val="center"/>
-      </w:pPr>
-      <w:r/>
-      <w:r>
-        <w:rPr>
-          <w:i/>
-          <w:color w:val="C02A2A"/>
-        </w:rPr>
-        <w:t>[Image not found: docs/d22_figures/coach_calibrate_countdown.png]</w:t>
-      </w:r>
-    </w:p>
-    <w:p>
-      <w:pPr>
-        <w:spacing w:after="200"/>
-        <w:jc w:val="center"/>
-      </w:pPr>
-      <w:r>
-        <w:rPr>
-          <w:rFonts w:ascii="Calibri" w:hAnsi="Calibri"/>
-          <w:i/>
-          <w:color w:val="6B6B6B"/>
-          <w:sz w:val="18"/>
-        </w:rPr>
-        <w:t>Coach calibration, 5-second countdown.</w:t>
-      </w:r>
-    </w:p>
-    <w:p>
-      <w:pPr>
         <w:pStyle w:val="Heading3"/>
       </w:pPr>
       <w:r>
@@ -1570,62 +1458,6 @@
     <w:p>
       <w:r>
         <w:t>Feedback is presented as transient, road-sign-style cards centered over the body for about 4 seconds when a flag is raised, with an animated corrective arrow attached to the relevant joint. A clean rep triggers a small mint check overlay. No metric or technical detail (joint angle, deviation %, z-score) is shown on this screen. The surface is intentionally non-clinical to keep the participant in the body, not in the data.</w:t>
-      </w:r>
-    </w:p>
-    <w:p>
-      <w:pPr>
-        <w:jc w:val="center"/>
-      </w:pPr>
-      <w:r/>
-      <w:r>
-        <w:rPr>
-          <w:i/>
-          <w:color w:val="C02A2A"/>
-        </w:rPr>
-        <w:t>[Image not found: docs/d22_figures/coach_active.png]</w:t>
-      </w:r>
-    </w:p>
-    <w:p>
-      <w:pPr>
-        <w:spacing w:after="200"/>
-        <w:jc w:val="center"/>
-      </w:pPr>
-      <w:r>
-        <w:rPr>
-          <w:rFonts w:ascii="Calibri" w:hAnsi="Calibri"/>
-          <w:i/>
-          <w:color w:val="6B6B6B"/>
-          <w:sz w:val="18"/>
-        </w:rPr>
-        <w:t>Coach active session, skeleton overlay and HUD.</w:t>
-      </w:r>
-    </w:p>
-    <w:p>
-      <w:pPr>
-        <w:jc w:val="center"/>
-      </w:pPr>
-      <w:r/>
-      <w:r>
-        <w:rPr>
-          <w:i/>
-          <w:color w:val="C02A2A"/>
-        </w:rPr>
-        <w:t>[Image not found: docs/d22_figures/coach_active_fault.png]</w:t>
-      </w:r>
-    </w:p>
-    <w:p>
-      <w:pPr>
-        <w:spacing w:after="200"/>
-        <w:jc w:val="center"/>
-      </w:pPr>
-      <w:r>
-        <w:rPr>
-          <w:rFonts w:ascii="Calibri" w:hAnsi="Calibri"/>
-          <w:i/>
-          <w:color w:val="6B6B6B"/>
-          <w:sz w:val="18"/>
-        </w:rPr>
-        <w:t>Coach active session, fault card with corrective arrow.</w:t>
       </w:r>
     </w:p>
     <w:p>
@@ -1658,34 +1490,6 @@
     </w:p>
     <w:p>
       <w:pPr>
-        <w:jc w:val="center"/>
-      </w:pPr>
-      <w:r/>
-      <w:r>
-        <w:rPr>
-          <w:i/>
-          <w:color w:val="C02A2A"/>
-        </w:rPr>
-        <w:t>[Image not found: docs/d22_figures/coach_done.png]</w:t>
-      </w:r>
-    </w:p>
-    <w:p>
-      <w:pPr>
-        <w:spacing w:after="200"/>
-        <w:jc w:val="center"/>
-      </w:pPr>
-      <w:r>
-        <w:rPr>
-          <w:rFonts w:ascii="Calibri" w:hAnsi="Calibri"/>
-          <w:i/>
-          <w:color w:val="6B6B6B"/>
-          <w:sz w:val="18"/>
-        </w:rPr>
-        <w:t>Coach post-session summary.</w:t>
-      </w:r>
-    </w:p>
-    <w:p>
-      <w:pPr>
         <w:pStyle w:val="Heading3"/>
       </w:pPr>
       <w:r>
@@ -1705,34 +1509,6 @@
     <w:p>
       <w:r>
         <w:t>The day grouping is important because rehabilitation protocols often involve multiple short sessions per day rather than one long one, and the previous flat list buried that pattern.</w:t>
-      </w:r>
-    </w:p>
-    <w:p>
-      <w:pPr>
-        <w:jc w:val="center"/>
-      </w:pPr>
-      <w:r/>
-      <w:r>
-        <w:rPr>
-          <w:i/>
-          <w:color w:val="C02A2A"/>
-        </w:rPr>
-        <w:t>[Image not found: docs/d22_figures/coach_history.png]</w:t>
-      </w:r>
-    </w:p>
-    <w:p>
-      <w:pPr>
-        <w:spacing w:after="200"/>
-        <w:jc w:val="center"/>
-      </w:pPr>
-      <w:r>
-        <w:rPr>
-          <w:rFonts w:ascii="Calibri" w:hAnsi="Calibri"/>
-          <w:i/>
-          <w:color w:val="6B6B6B"/>
-          <w:sz w:val="18"/>
-        </w:rPr>
-        <w:t>Coach history, day-grouped sessions with multi-session days.</w:t>
       </w:r>
     </w:p>
     <w:p>
@@ -1807,34 +1583,6 @@
     </w:p>
     <w:p>
       <w:pPr>
-        <w:jc w:val="center"/>
-      </w:pPr>
-      <w:r/>
-      <w:r>
-        <w:rPr>
-          <w:i/>
-          <w:color w:val="C02A2A"/>
-        </w:rPr>
-        <w:t>[Image not found: docs/d22_figures/coach_settings.png]</w:t>
-      </w:r>
-    </w:p>
-    <w:p>
-      <w:pPr>
-        <w:spacing w:after="200"/>
-        <w:jc w:val="center"/>
-      </w:pPr>
-      <w:r>
-        <w:rPr>
-          <w:rFonts w:ascii="Calibri" w:hAnsi="Calibri"/>
-          <w:i/>
-          <w:color w:val="6B6B6B"/>
-          <w:sz w:val="18"/>
-        </w:rPr>
-        <w:t>Coach settings.</w:t>
-      </w:r>
-    </w:p>
-    <w:p>
-      <w:pPr>
         <w:pStyle w:val="Heading3"/>
       </w:pPr>
       <w:r>
@@ -1854,34 +1602,6 @@
       </w:r>
       <w:r>
         <w:t xml:space="preserve"> component is mounted by the Coach shell whenever an error is set. It overrides any active screen with a centered card containing a tone-appropriate icon (camera, network, pose, generic), a title, a one-paragraph body, and up to two actions (Retry, Dismiss). The four icon variants share a single visual treatment and use the Coach accent palette so the error state never feels foreign.</w:t>
-      </w:r>
-    </w:p>
-    <w:p>
-      <w:pPr>
-        <w:jc w:val="center"/>
-      </w:pPr>
-      <w:r/>
-      <w:r>
-        <w:rPr>
-          <w:i/>
-          <w:color w:val="C02A2A"/>
-        </w:rPr>
-        <w:t>[Image not found: docs/d22_figures/coach_error.png]</w:t>
-      </w:r>
-    </w:p>
-    <w:p>
-      <w:pPr>
-        <w:spacing w:after="200"/>
-        <w:jc w:val="center"/>
-      </w:pPr>
-      <w:r>
-        <w:rPr>
-          <w:rFonts w:ascii="Calibri" w:hAnsi="Calibri"/>
-          <w:i/>
-          <w:color w:val="6B6B6B"/>
-          <w:sz w:val="18"/>
-        </w:rPr>
-        <w:t>Coach error state, camera unavailable variant.</w:t>
       </w:r>
     </w:p>
     <w:p>
@@ -1966,34 +1686,6 @@
     </w:p>
     <w:p>
       <w:pPr>
-        <w:jc w:val="center"/>
-      </w:pPr>
-      <w:r/>
-      <w:r>
-        <w:rPr>
-          <w:i/>
-          <w:color w:val="C02A2A"/>
-        </w:rPr>
-        <w:t>[Image not found: docs/d22_figures/therapist_login.png]</w:t>
-      </w:r>
-    </w:p>
-    <w:p>
-      <w:pPr>
-        <w:spacing w:after="200"/>
-        <w:jc w:val="center"/>
-      </w:pPr>
-      <w:r>
-        <w:rPr>
-          <w:rFonts w:ascii="Calibri" w:hAnsi="Calibri"/>
-          <w:i/>
-          <w:color w:val="6B6B6B"/>
-          <w:sz w:val="18"/>
-        </w:rPr>
-        <w:t>Therapist login.</w:t>
-      </w:r>
-    </w:p>
-    <w:p>
-      <w:pPr>
         <w:pStyle w:val="Heading3"/>
       </w:pPr>
       <w:r>
@@ -2064,62 +1756,6 @@
     <w:p>
       <w:r>
         <w:t>The cards are intentionally minimal. The detailed KPIs previously shown on the patient cards (sessions count, last FTSS, adherence %, open flags) are not absent. They are deferred to the Sessions view of that patient, where the therapist can see them in the context of session history and charts.</w:t>
-      </w:r>
-    </w:p>
-    <w:p>
-      <w:pPr>
-        <w:jc w:val="center"/>
-      </w:pPr>
-      <w:r/>
-      <w:r>
-        <w:rPr>
-          <w:i/>
-          <w:color w:val="C02A2A"/>
-        </w:rPr>
-        <w:t>[Image not found: docs/d22_figures/therapist_caseload_top.png]</w:t>
-      </w:r>
-    </w:p>
-    <w:p>
-      <w:pPr>
-        <w:spacing w:after="200"/>
-        <w:jc w:val="center"/>
-      </w:pPr>
-      <w:r>
-        <w:rPr>
-          <w:rFonts w:ascii="Calibri" w:hAnsi="Calibri"/>
-          <w:i/>
-          <w:color w:val="6B6B6B"/>
-          <w:sz w:val="18"/>
-        </w:rPr>
-        <w:t>Therapist caseload, overview tiles and at-risk panel.</w:t>
-      </w:r>
-    </w:p>
-    <w:p>
-      <w:pPr>
-        <w:jc w:val="center"/>
-      </w:pPr>
-      <w:r/>
-      <w:r>
-        <w:rPr>
-          <w:i/>
-          <w:color w:val="C02A2A"/>
-        </w:rPr>
-        <w:t>[Image not found: docs/d22_figures/therapist_caseload_grid.png]</w:t>
-      </w:r>
-    </w:p>
-    <w:p>
-      <w:pPr>
-        <w:spacing w:after="200"/>
-        <w:jc w:val="center"/>
-      </w:pPr>
-      <w:r>
-        <w:rPr>
-          <w:rFonts w:ascii="Calibri" w:hAnsi="Calibri"/>
-          <w:i/>
-          <w:color w:val="6B6B6B"/>
-          <w:sz w:val="18"/>
-        </w:rPr>
-        <w:t>Therapist caseload, compact patient grid (click a name to open).</w:t>
       </w:r>
     </w:p>
     <w:p>
@@ -2206,62 +1842,6 @@
     <w:p>
       <w:r>
         <w:t>This consolidation of the per-patient detail into Sessions removes the previous duplication where Caseload also acted as a patient-detail page.</w:t>
-      </w:r>
-    </w:p>
-    <w:p>
-      <w:pPr>
-        <w:jc w:val="center"/>
-      </w:pPr>
-      <w:r/>
-      <w:r>
-        <w:rPr>
-          <w:i/>
-          <w:color w:val="C02A2A"/>
-        </w:rPr>
-        <w:t>[Image not found: docs/d22_figures/therapist_sessions_all.png]</w:t>
-      </w:r>
-    </w:p>
-    <w:p>
-      <w:pPr>
-        <w:spacing w:after="200"/>
-        <w:jc w:val="center"/>
-      </w:pPr>
-      <w:r>
-        <w:rPr>
-          <w:rFonts w:ascii="Calibri" w:hAnsi="Calibri"/>
-          <w:i/>
-          <w:color w:val="6B6B6B"/>
-          <w:sz w:val="18"/>
-        </w:rPr>
-        <w:t>Therapist Sessions, all-patients mode (day-grouped).</w:t>
-      </w:r>
-    </w:p>
-    <w:p>
-      <w:pPr>
-        <w:jc w:val="center"/>
-      </w:pPr>
-      <w:r/>
-      <w:r>
-        <w:rPr>
-          <w:i/>
-          <w:color w:val="C02A2A"/>
-        </w:rPr>
-        <w:t>[Image not found: docs/d22_figures/therapist_sessions_patient.png]</w:t>
-      </w:r>
-    </w:p>
-    <w:p>
-      <w:pPr>
-        <w:spacing w:after="200"/>
-        <w:jc w:val="center"/>
-      </w:pPr>
-      <w:r>
-        <w:rPr>
-          <w:rFonts w:ascii="Calibri" w:hAnsi="Calibri"/>
-          <w:i/>
-          <w:color w:val="6B6B6B"/>
-          <w:sz w:val="18"/>
-        </w:rPr>
-        <w:t>Therapist Sessions, single-patient mode with charts and notes.</w:t>
       </w:r>
     </w:p>
     <w:p>
@@ -2360,34 +1940,6 @@
     </w:p>
     <w:p>
       <w:pPr>
-        <w:jc w:val="center"/>
-      </w:pPr>
-      <w:r/>
-      <w:r>
-        <w:rPr>
-          <w:i/>
-          <w:color w:val="C02A2A"/>
-        </w:rPr>
-        <w:t>[Image not found: docs/d22_figures/therapist_session_modal.png]</w:t>
-      </w:r>
-    </w:p>
-    <w:p>
-      <w:pPr>
-        <w:spacing w:after="200"/>
-        <w:jc w:val="center"/>
-      </w:pPr>
-      <w:r>
-        <w:rPr>
-          <w:rFonts w:ascii="Calibri" w:hAnsi="Calibri"/>
-          <w:i/>
-          <w:color w:val="6B6B6B"/>
-          <w:sz w:val="18"/>
-        </w:rPr>
-        <w:t>Therapist session detail modal, replay player and rep chips.</w:t>
-      </w:r>
-    </w:p>
-    <w:p>
-      <w:pPr>
         <w:pStyle w:val="Heading3"/>
       </w:pPr>
       <w:r>
@@ -2423,34 +1975,6 @@
     </w:p>
     <w:p>
       <w:pPr>
-        <w:jc w:val="center"/>
-      </w:pPr>
-      <w:r/>
-      <w:r>
-        <w:rPr>
-          <w:i/>
-          <w:color w:val="C02A2A"/>
-        </w:rPr>
-        <w:t>[Image not found: docs/d22_figures/therapist_reports.png]</w:t>
-      </w:r>
-    </w:p>
-    <w:p>
-      <w:pPr>
-        <w:spacing w:after="200"/>
-        <w:jc w:val="center"/>
-      </w:pPr>
-      <w:r>
-        <w:rPr>
-          <w:rFonts w:ascii="Calibri" w:hAnsi="Calibri"/>
-          <w:i/>
-          <w:color w:val="6B6B6B"/>
-          <w:sz w:val="18"/>
-        </w:rPr>
-        <w:t>Therapist reports, caseload mode (heatmap, adherence, error mix).</w:t>
-      </w:r>
-    </w:p>
-    <w:p>
-      <w:pPr>
         <w:pStyle w:val="Heading3"/>
       </w:pPr>
       <w:r>
@@ -2460,34 +1984,6 @@
     <w:p>
       <w:r>
         <w:t>Two cards. Profile (read-only initials and role) and Preferences (unit system, email alerts on red flags, weekly digest). Save triggers a toast.</w:t>
-      </w:r>
-    </w:p>
-    <w:p>
-      <w:pPr>
-        <w:jc w:val="center"/>
-      </w:pPr>
-      <w:r/>
-      <w:r>
-        <w:rPr>
-          <w:i/>
-          <w:color w:val="C02A2A"/>
-        </w:rPr>
-        <w:t>[Image not found: docs/d22_figures/therapist_settings.png]</w:t>
-      </w:r>
-    </w:p>
-    <w:p>
-      <w:pPr>
-        <w:spacing w:after="200"/>
-        <w:jc w:val="center"/>
-      </w:pPr>
-      <w:r>
-        <w:rPr>
-          <w:rFonts w:ascii="Calibri" w:hAnsi="Calibri"/>
-          <w:i/>
-          <w:color w:val="6B6B6B"/>
-          <w:sz w:val="18"/>
-        </w:rPr>
-        <w:t>Therapist settings.</w:t>
       </w:r>
     </w:p>
     <w:p>
@@ -4670,17 +4166,7 @@
     </w:p>
     <w:p>
       <w:r>
-        <w:t xml:space="preserve">Screenshots of each screen referenced in Sections 5 and 6 are embedded above and stored under </w:t>
-      </w:r>
-      <w:r>
-        <w:rPr>
-          <w:rFonts w:ascii="Consolas" w:hAnsi="Consolas"/>
-          <w:sz w:val="20"/>
-        </w:rPr>
-        <w:t>docs/d22_figures/</w:t>
-      </w:r>
-      <w:r>
-        <w:t>.</w:t>
+        <w:t>Rather than embedding still screenshots of each screen described in Sections 5 and 6, this deliverable relies on the live URLs above. Every screen is directly reachable and interactive in a browser, which better conveys behaviour that is inherently dynamic (skeleton overlay, fault feedback, scrub bar, day-grouped history). The two flow diagrams (Coach state machine, Therapist navigation map) in Sections 5 and 6 are the only embedded figures.</w:t>
       </w:r>
     </w:p>
     <w:p>

</xml_diff>